<commit_message>
Complete Russian Translation: Protocol, Supplementary Tables and Figure Labels
Translate the analysis protocol (docs/protocol_ru.md; the English file stays the
version of record) and the column headers, row labels and notes of the Russian
supplementary tables. src/figures.py gains FIG_LANG=ru, which writes *_ru figures
with Russian labels; English figures are byte-identical. The supplement no longer
prints a duplicate LaTeX label before 'Figure S<n>' and sets its wide tables in a
smaller font (both languages).

Co-Authored-By: Claude Opus 5.5 <noreply@anthropic.com>
</commit_message>
<xml_diff>
--- a/paper/manuscript_ru.docx
+++ b/paper/manuscript_ru.docx
@@ -11942,7 +11942,7 @@
               <a:graphicData uri="http://schemas.openxmlformats.org/drawingml/2006/picture">
                 <pic:pic>
                   <pic:nvPicPr>
-                    <pic:cNvPr descr="figures/fig1_examples.png" id="41" name="Picture"/>
+                    <pic:cNvPr descr="figures/fig1_examples_ru.png" id="41" name="Picture"/>
                     <pic:cNvPicPr>
                       <a:picLocks noChangeArrowheads="1" noChangeAspect="1"/>
                     </pic:cNvPicPr>
@@ -11990,14 +11990,14 @@
       <w:r>
         <w:drawing>
           <wp:inline>
-            <wp:extent cx="5334000" cy="2479589"/>
+            <wp:extent cx="5334000" cy="2455736"/>
             <wp:effectExtent b="0" l="0" r="0" t="0"/>
             <wp:docPr descr="Артефакты артериальной кривой вокруг измерений манжетой, по типам артефакта." title="" id="43" name="Picture"/>
             <a:graphic>
               <a:graphicData uri="http://schemas.openxmlformats.org/drawingml/2006/picture">
                 <pic:pic>
                   <pic:nvPicPr>
-                    <pic:cNvPr descr="figures/fig5_nibp_cuff.png" id="44" name="Picture"/>
+                    <pic:cNvPr descr="figures/fig5_nibp_cuff_ru.png" id="44" name="Picture"/>
                     <pic:cNvPicPr>
                       <a:picLocks noChangeArrowheads="1" noChangeAspect="1"/>
                     </pic:cNvPicPr>
@@ -12011,7 +12011,7 @@
                   <pic:spPr bwMode="auto">
                     <a:xfrm>
                       <a:off x="0" y="0"/>
-                      <a:ext cx="5334000" cy="2479589"/>
+                      <a:ext cx="5334000" cy="2455736"/>
                     </a:xfrm>
                     <a:prstGeom prst="rect">
                       <a:avLst/>
@@ -12052,7 +12052,7 @@
               <a:graphicData uri="http://schemas.openxmlformats.org/drawingml/2006/picture">
                 <pic:pic>
                   <pic:nvPicPr>
-                    <pic:cNvPr descr="figures/fig2_spurious.png" id="47" name="Picture"/>
+                    <pic:cNvPr descr="figures/fig2_spurious_ru.png" id="47" name="Picture"/>
                     <pic:cNvPicPr>
                       <a:picLocks noChangeArrowheads="1" noChangeAspect="1"/>
                     </pic:cNvPicPr>
@@ -12107,7 +12107,7 @@
               <a:graphicData uri="http://schemas.openxmlformats.org/drawingml/2006/picture">
                 <pic:pic>
                   <pic:nvPicPr>
-                    <pic:cNvPr descr="figures/fig6_forest.png" id="50" name="Picture"/>
+                    <pic:cNvPr descr="figures/fig6_forest_ru.png" id="50" name="Picture"/>
                     <pic:cNvPicPr>
                       <a:picLocks noChangeArrowheads="1" noChangeAspect="1"/>
                     </pic:cNvPicPr>

</xml_diff>